<commit_message>
Added and updated hello.xml in GitWork branch
</commit_message>
<xml_diff>
--- a/deepskilling/week-5/Additional/OUTPUT_SS.docx
+++ b/deepskilling/week-5/Additional/OUTPUT_SS.docx
@@ -480,6 +480,7 @@
         <w:ind w:leftChars="0"/>
         <w:jc w:val="both"/>
       </w:pPr>
+      <w:bookmarkStart w:id="0" w:name="_GoBack"/>
       <w:r>
         <w:drawing>
           <wp:inline distT="0" distB="0" distL="114300" distR="114300">
@@ -523,6 +524,7 @@
           </wp:inline>
         </w:drawing>
       </w:r>
+      <w:bookmarkEnd w:id="0"/>
     </w:p>
     <w:p>
       <w:pPr>
@@ -1488,8 +1490,6 @@
         <w:ind w:leftChars="0"/>
         <w:jc w:val="both"/>
       </w:pPr>
-      <w:bookmarkStart w:id="0" w:name="_GoBack"/>
-      <w:bookmarkEnd w:id="0"/>
     </w:p>
     <w:p>
       <w:pPr>

</xml_diff>